<commit_message>
docs: align the thesis proposal form with the current PPT
</commit_message>
<xml_diff>
--- a/docs/3. 데이터사이언스융합학과 연구계획서 양식_논문_2025711356_유진.docx
+++ b/docs/3. 데이터사이언스융합학과 연구계획서 양식_논문_2025711356_유진.docx
@@ -988,7 +988,7 @@
                 <w:b w:val="0"/>
                 <w:sz w:val="24"/>
               </w:rPr>
-              <w:t>검색증강생성(RAG)에서 검색 문서 간 충돌이 발생하면, 추론 모델(Reasoning LLM)은 내부 사고 과정(&lt;think&gt;)에서는 올바른 결론에 도달하고도 최종 답변에는 이를 반영하지 못하는 추론-답변 불일치(Reasoning-Answer Inconsistency)를 보일 수 있다. 본 연구는 이 현상을 (1) 자기일관성 지표로 정량 진단하고, (2) 충돌 대조군으로 그 현상이 충돌 상황에 고유한 것인지 검증하며, (3) 인과 개입 실험으로 사고와 답변 간 실제 인과관계를 규명하는 것을 목적으로 한다.</w:t>
+              <w:t xml:space="preserve">검색증강생성(RAG)에서 검색 문서 간 충돌이 발생하면, 추론 모델(Reasoning LLM)은 내부 사고 과정(&lt;think&gt;)에서는 올바른 결론에 도달하고도 최종 답변에서 이를 유실하는 추론-답변 불일치(AIR)를 보일 수 있다. 그러나 정답률(EM)만으로는 모델이 '왜·어디서' 맞고 틀렸는지 알 수 없다 — 같은 정답도 대조 추론의 산물과 우연이 섞여 있고, 같은 오답도 충돌을 못 본 것·보고도 오판한 것·옳게 판단하고도 답변에서 뒤집은 것이 한 숫자에 뭉개진다. 본 연구는 충돌 하 사고→답변 과정을 인지·해소·표출 3단계 전환 행렬로 분해해 모든 결과를 네 경로(정상·Shortcut·Discordant Hit·Blind-Hit)에 귀속하는 진단 프레임워크를 정립하고, 이를 통해 (1) 완화 기법이 올린 정답률이 진짜 대조 추론에서 온 것인지 경로별로 회계 감사(audit)하며, (2) 충돌 대조군으로 관측 현상이 충돌 고유의 실패인지 검증하고, (3) 인과 개입(truncation·resampling)으로 사고 결론이 답변을 실제로 구동하는지 규명하는 것을 목적으로 한다.</w:t>
             </w:r>
           </w:p>
         </w:tc>
@@ -1067,7 +1067,7 @@
                 <w:b w:val="0"/>
                 <w:sz w:val="23"/>
               </w:rPr>
-              <w:t>① 데이터셋: 실제 웹검색 기반 충돌 벤치마크 DRAGged(458건)·다중문서 벤치마크 RAMDocs(500건) 활용</w:t>
+              <w:t xml:space="preserve">① 데이터셋: 실제 웹검색 기반 충돌 벤치마크 DRAGged(458건, 전문가가 5개 충돌 유형으로 라벨링) · 자연 발생 충돌 QACC(1,617건 중 충돌 381건, 검정력 보강) · 다중문서 벤치마크 RAMDocs(500건, 오정보·노이즈 통제) — 세 데이터셋을 공통 스키마(question·correct_answers·chunks[correct/conflict/noise])로 정규화하되, 충돌 정의와 문서 길이가 상이하므로 풀링하지 않고 데이터셋별로 분리 보고한다.</w:t>
             </w:r>
           </w:p>
           <w:p>
@@ -1077,7 +1077,7 @@
                 <w:b w:val="0"/>
                 <w:sz w:val="23"/>
               </w:rPr>
-              <w:t>② 진단 프로토콜: 사고과정을 인지→판정→표출 3단계로 라벨링, 추론-답변 불일치율(AIR)·암묵적 도약률(Shortcut) 등으로 병목 지점 정량화</w:t>
+              <w:t xml:space="preserve">② 진단 프로토콜: 사고 과정을 인지(L1)→해소(L2)→표출(FA) 3단계로 라벨링하여 하나의 전환 행렬을 도출하고, 정답을 정상·Shortcut(암묵적 도약)·Discordant Hit(불협 적중)·Blind-Hit(맹목 적중) 네 경로로 상호배타·전수 분해한다. 단계별 병목은 Loss_L1(인지 실패)·Loss_L2(판정 오류)·AIR(추론-답변 불일치)로 계량하며, 모든 조건부 지표는 분모 N과 신뢰구간을 병기한다. 라벨링은 규칙 기반 + LLM-as-a-Judge 하이브리드로 수행하고 인간 검증(κ ≥ 0.7)으로 신뢰도를 확보한다.</w:t>
             </w:r>
           </w:p>
           <w:p>
@@ -1087,7 +1087,7 @@
                 <w:b w:val="0"/>
                 <w:sz w:val="23"/>
               </w:rPr>
-              <w:t>③ 실험: 완화기법 해부, truncation·resampling 등 인과개입을 통한 사고-답변 인과관계 검증, 경량 처방(AIR-Gate), 충돌 고유성 대조군 분석</w:t>
+              <w:t xml:space="preserve">③ 실험: (실험 1, RQ1·RQ2) 5개 완화 환경(Standard·CAD·CD2·Recency/Authority·Reflection)에서 전환 행렬을 도출하고, 완화 전후를 문항별로 짝지어 경로 이동을 추적함으로써 EM 상승분의 출처를 회계한다 — 정당 이득 비율(LGR)·숨은 퇴행율(HR)·flip률로 '정확도 상승 ≠ 추론 개선'을 정량화한다. (실험 2, RQ3) 충돌 vs 비충돌 대조군과 thinking on/off 토글로 관측 현상이 충돌·사고 채널에 고유한지 귀속한다. (실험 3, RQ4) truncation·resampling 개입으로 사고 결론의 인과적 기여를 검증하고, 경로별 취약성(flip률)을 비교한다.</w:t>
             </w:r>
           </w:p>
           <w:p>
@@ -1097,7 +1097,7 @@
                 <w:b w:val="0"/>
                 <w:sz w:val="23"/>
               </w:rPr>
-              <w:t>④ 대상 모델: Qwen3.6-27B · Olmo-3.1-32B-Think · gpt-oss-20b (오픈소스 추론모델 3개 계열)</w:t>
+              <w:t xml:space="preserve">④ 대상 모델: Qwen3.6-27B(주력, thinking on/off 하드 토글) · gpt-oss-20b(교차 계열·MoE, Harmony 채널) · Gemma-3-27B(추론 채널이 없는 비-thinking 대조군) — 비양자화(bf16) 서빙, 권장 디코딩(t=0.6, top-p 0.95)에 시드 5회 이상 반복 후 Paired Bootstrap 95% CI로 검정한다.</w:t>
             </w:r>
           </w:p>
         </w:tc>

</xml_diff>